<commit_message>
Add architect documents, session launch implementation, and Terraform modules
- docs: ADO story, architecture diagrams, implementation plan (MD, HTML, DOCX)
- docs: AKS migration Q&A, NEW_MACHINE_SETUP guide
- src: async session launch (SessionLaunchWorker, ISessionProvisioningQueue)
- src: TerraformOrchestrator, TerraformRunner, TerraformOptions
- src: SessionEndpoints (202 Accepted), Program.cs DI registration updates
- terraform: workspace-storage, workspace-k8s, session modules with lock files
- .gitignore: exclude **/.terraform/ provider cache directories

Co-Authored-By: Claude Sonnet 4.6 <noreply@anthropic.com>
</commit_message>
<xml_diff>
--- a/SecureResearchWorkspace/SecureResearchWorkspace/SRW-POC-Architecture-Comparison.docx
+++ b/SecureResearchWorkspace/SecureResearchWorkspace/SRW-POC-Architecture-Comparison.docx
@@ -1838,7 +1838,15 @@
         <w:pStyle w:val="ListBullet"/>
       </w:pPr>
       <w:r>
-        <w:t>Per-user data isolation (re-introducing subPath if compliance demands).</w:t>
+        <w:t xml:space="preserve">Per-user data isolation (introducing </w:t>
+      </w:r>
+      <w:proofErr w:type="spellStart"/>
+      <w:r>
+        <w:t>subPath</w:t>
+      </w:r>
+      <w:proofErr w:type="spellEnd"/>
+      <w:r>
+        <w:t xml:space="preserve"> if compliance demands).</w:t>
       </w:r>
     </w:p>
     <w:p>
@@ -1867,277 +1875,7 @@
           <w:color w:val="0F4C81"/>
         </w:rPr>
         <w:lastRenderedPageBreak/>
-        <w:t>7. Risks and Mitigations</w:t>
-      </w:r>
-    </w:p>
-    <w:tbl>
-      <w:tblPr>
-        <w:tblStyle w:val="LightGrid-Accent1"/>
-        <w:tblW w:w="0" w:type="auto"/>
-        <w:tblLook w:val="04A0" w:firstRow="1" w:lastRow="0" w:firstColumn="1" w:lastColumn="0" w:noHBand="0" w:noVBand="1"/>
-      </w:tblPr>
-      <w:tblGrid>
-        <w:gridCol w:w="4986"/>
-        <w:gridCol w:w="4986"/>
-      </w:tblGrid>
-      <w:tr>
-        <w:trPr>
-          <w:cnfStyle w:val="100000000000" w:firstRow="1" w:lastRow="0" w:firstColumn="0" w:lastColumn="0" w:oddVBand="0" w:evenVBand="0" w:oddHBand="0" w:evenHBand="0" w:firstRowFirstColumn="0" w:firstRowLastColumn="0" w:lastRowFirstColumn="0" w:lastRowLastColumn="0"/>
-        </w:trPr>
-        <w:tc>
-          <w:tcPr>
-            <w:cnfStyle w:val="001000000000" w:firstRow="0" w:lastRow="0" w:firstColumn="1" w:lastColumn="0" w:oddVBand="0" w:evenVBand="0" w:oddHBand="0" w:evenHBand="0" w:firstRowFirstColumn="0" w:firstRowLastColumn="0" w:lastRowFirstColumn="0" w:lastRowLastColumn="0"/>
-            <w:tcW w:w="4986" w:type="dxa"/>
-            <w:shd w:val="clear" w:color="auto" w:fill="0F4C81"/>
-          </w:tcPr>
-          <w:p>
-            <w:r>
-              <w:rPr>
-                <w:color w:val="FFFFFF"/>
-              </w:rPr>
-              <w:t>Risk</w:t>
-            </w:r>
-          </w:p>
-        </w:tc>
-        <w:tc>
-          <w:tcPr>
-            <w:tcW w:w="4986" w:type="dxa"/>
-            <w:shd w:val="clear" w:color="auto" w:fill="0F4C81"/>
-          </w:tcPr>
-          <w:p>
-            <w:pPr>
-              <w:cnfStyle w:val="100000000000" w:firstRow="1" w:lastRow="0" w:firstColumn="0" w:lastColumn="0" w:oddVBand="0" w:evenVBand="0" w:oddHBand="0" w:evenHBand="0" w:firstRowFirstColumn="0" w:firstRowLastColumn="0" w:lastRowFirstColumn="0" w:lastRowLastColumn="0"/>
-            </w:pPr>
-            <w:r>
-              <w:rPr>
-                <w:color w:val="FFFFFF"/>
-              </w:rPr>
-              <w:t>Mitigation</w:t>
-            </w:r>
-          </w:p>
-        </w:tc>
-      </w:tr>
-      <w:tr>
-        <w:trPr>
-          <w:cnfStyle w:val="000000100000" w:firstRow="0" w:lastRow="0" w:firstColumn="0" w:lastColumn="0" w:oddVBand="0" w:evenVBand="0" w:oddHBand="1" w:evenHBand="0" w:firstRowFirstColumn="0" w:firstRowLastColumn="0" w:lastRowFirstColumn="0" w:lastRowLastColumn="0"/>
-        </w:trPr>
-        <w:tc>
-          <w:tcPr>
-            <w:cnfStyle w:val="001000000000" w:firstRow="0" w:lastRow="0" w:firstColumn="1" w:lastColumn="0" w:oddVBand="0" w:evenVBand="0" w:oddHBand="0" w:evenHBand="0" w:firstRowFirstColumn="0" w:firstRowLastColumn="0" w:lastRowFirstColumn="0" w:lastRowLastColumn="0"/>
-            <w:tcW w:w="4986" w:type="dxa"/>
-          </w:tcPr>
-          <w:p>
-            <w:r>
-              <w:rPr>
-                <w:sz w:val="20"/>
-              </w:rPr>
-              <w:t>Kubernetes operational learning curve</w:t>
-            </w:r>
-          </w:p>
-        </w:tc>
-        <w:tc>
-          <w:tcPr>
-            <w:tcW w:w="4986" w:type="dxa"/>
-          </w:tcPr>
-          <w:p>
-            <w:pPr>
-              <w:cnfStyle w:val="000000100000" w:firstRow="0" w:lastRow="0" w:firstColumn="0" w:lastColumn="0" w:oddVBand="0" w:evenVBand="0" w:oddHBand="1" w:evenHBand="0" w:firstRowFirstColumn="0" w:firstRowLastColumn="0" w:lastRowFirstColumn="0" w:lastRowLastColumn="0"/>
-            </w:pPr>
-            <w:r>
-              <w:rPr>
-                <w:sz w:val="20"/>
-              </w:rPr>
-              <w:t>Provide runbooks; use managed AKS with auto-upgrade; centralise orchestration in the SRW API so most operations are abstracted from researchers.</w:t>
-            </w:r>
-          </w:p>
-        </w:tc>
-      </w:tr>
-      <w:tr>
-        <w:trPr>
-          <w:cnfStyle w:val="000000010000" w:firstRow="0" w:lastRow="0" w:firstColumn="0" w:lastColumn="0" w:oddVBand="0" w:evenVBand="0" w:oddHBand="0" w:evenHBand="1" w:firstRowFirstColumn="0" w:firstRowLastColumn="0" w:lastRowFirstColumn="0" w:lastRowLastColumn="0"/>
-        </w:trPr>
-        <w:tc>
-          <w:tcPr>
-            <w:cnfStyle w:val="001000000000" w:firstRow="0" w:lastRow="0" w:firstColumn="1" w:lastColumn="0" w:oddVBand="0" w:evenVBand="0" w:oddHBand="0" w:evenHBand="0" w:firstRowFirstColumn="0" w:firstRowLastColumn="0" w:lastRowFirstColumn="0" w:lastRowLastColumn="0"/>
-            <w:tcW w:w="4986" w:type="dxa"/>
-          </w:tcPr>
-          <w:p>
-            <w:r>
-              <w:rPr>
-                <w:sz w:val="20"/>
-              </w:rPr>
-              <w:t>Storage account quota (250 per subscription per region)</w:t>
-            </w:r>
-          </w:p>
-        </w:tc>
-        <w:tc>
-          <w:tcPr>
-            <w:tcW w:w="4986" w:type="dxa"/>
-          </w:tcPr>
-          <w:p>
-            <w:pPr>
-              <w:cnfStyle w:val="000000010000" w:firstRow="0" w:lastRow="0" w:firstColumn="0" w:lastColumn="0" w:oddVBand="0" w:evenVBand="0" w:oddHBand="0" w:evenHBand="1" w:firstRowFirstColumn="0" w:firstRowLastColumn="0" w:lastRowFirstColumn="0" w:lastRowLastColumn="0"/>
-            </w:pPr>
-            <w:r>
-              <w:rPr>
-                <w:sz w:val="20"/>
-              </w:rPr>
-              <w:t>Sufficient headroom for 50 workspaces; request quota increase if planning beyond ~200 workspaces or co-locate workspaces in a single storage account.</w:t>
-            </w:r>
-          </w:p>
-        </w:tc>
-      </w:tr>
-      <w:tr>
-        <w:trPr>
-          <w:cnfStyle w:val="000000100000" w:firstRow="0" w:lastRow="0" w:firstColumn="0" w:lastColumn="0" w:oddVBand="0" w:evenVBand="0" w:oddHBand="1" w:evenHBand="0" w:firstRowFirstColumn="0" w:firstRowLastColumn="0" w:lastRowFirstColumn="0" w:lastRowLastColumn="0"/>
-        </w:trPr>
-        <w:tc>
-          <w:tcPr>
-            <w:cnfStyle w:val="001000000000" w:firstRow="0" w:lastRow="0" w:firstColumn="1" w:lastColumn="0" w:oddVBand="0" w:evenVBand="0" w:oddHBand="0" w:evenHBand="0" w:firstRowFirstColumn="0" w:firstRowLastColumn="0" w:lastRowFirstColumn="0" w:lastRowLastColumn="0"/>
-            <w:tcW w:w="4986" w:type="dxa"/>
-          </w:tcPr>
-          <w:p>
-            <w:r>
-              <w:rPr>
-                <w:sz w:val="20"/>
-              </w:rPr>
-              <w:t>Service Bus message redelivery / poison messages</w:t>
-            </w:r>
-          </w:p>
-        </w:tc>
-        <w:tc>
-          <w:tcPr>
-            <w:tcW w:w="4986" w:type="dxa"/>
-          </w:tcPr>
-          <w:p>
-            <w:pPr>
-              <w:cnfStyle w:val="000000100000" w:firstRow="0" w:lastRow="0" w:firstColumn="0" w:lastColumn="0" w:oddVBand="0" w:evenVBand="0" w:oddHBand="1" w:evenHBand="0" w:firstRowFirstColumn="0" w:firstRowLastColumn="0" w:lastRowFirstColumn="0" w:lastRowLastColumn="0"/>
-            </w:pPr>
-            <w:r>
-              <w:rPr>
-                <w:sz w:val="20"/>
-              </w:rPr>
-              <w:t>MaxDeliveryCount=10 with dead-letter queue; alerting on dead-letter depth; consumers are idempotent and skip already-Active workspaces.</w:t>
-            </w:r>
-          </w:p>
-        </w:tc>
-      </w:tr>
-      <w:tr>
-        <w:trPr>
-          <w:cnfStyle w:val="000000010000" w:firstRow="0" w:lastRow="0" w:firstColumn="0" w:lastColumn="0" w:oddVBand="0" w:evenVBand="0" w:oddHBand="0" w:evenHBand="1" w:firstRowFirstColumn="0" w:firstRowLastColumn="0" w:lastRowFirstColumn="0" w:lastRowLastColumn="0"/>
-        </w:trPr>
-        <w:tc>
-          <w:tcPr>
-            <w:cnfStyle w:val="001000000000" w:firstRow="0" w:lastRow="0" w:firstColumn="1" w:lastColumn="0" w:oddVBand="0" w:evenVBand="0" w:oddHBand="0" w:evenHBand="0" w:firstRowFirstColumn="0" w:firstRowLastColumn="0" w:lastRowFirstColumn="0" w:lastRowLastColumn="0"/>
-            <w:tcW w:w="4986" w:type="dxa"/>
-          </w:tcPr>
-          <w:p>
-            <w:r>
-              <w:rPr>
-                <w:sz w:val="20"/>
-              </w:rPr>
-              <w:t>Public IP exposure for ingress</w:t>
-            </w:r>
-          </w:p>
-        </w:tc>
-        <w:tc>
-          <w:tcPr>
-            <w:tcW w:w="4986" w:type="dxa"/>
-          </w:tcPr>
-          <w:p>
-            <w:pPr>
-              <w:cnfStyle w:val="000000010000" w:firstRow="0" w:lastRow="0" w:firstColumn="0" w:lastColumn="0" w:oddVBand="0" w:evenVBand="0" w:oddHBand="0" w:evenHBand="1" w:firstRowFirstColumn="0" w:firstRowLastColumn="0" w:lastRowFirstColumn="0" w:lastRowLastColumn="0"/>
-            </w:pPr>
-            <w:r>
-              <w:rPr>
-                <w:sz w:val="20"/>
-              </w:rPr>
-              <w:t>Use internal load balancer or Application Gateway with WAF; private cluster option available for high-compliance deployments.</w:t>
-            </w:r>
-          </w:p>
-        </w:tc>
-      </w:tr>
-      <w:tr>
-        <w:trPr>
-          <w:cnfStyle w:val="000000100000" w:firstRow="0" w:lastRow="0" w:firstColumn="0" w:lastColumn="0" w:oddVBand="0" w:evenVBand="0" w:oddHBand="1" w:evenHBand="0" w:firstRowFirstColumn="0" w:firstRowLastColumn="0" w:lastRowFirstColumn="0" w:lastRowLastColumn="0"/>
-        </w:trPr>
-        <w:tc>
-          <w:tcPr>
-            <w:cnfStyle w:val="001000000000" w:firstRow="0" w:lastRow="0" w:firstColumn="1" w:lastColumn="0" w:oddVBand="0" w:evenVBand="0" w:oddHBand="0" w:evenHBand="0" w:firstRowFirstColumn="0" w:firstRowLastColumn="0" w:lastRowFirstColumn="0" w:lastRowLastColumn="0"/>
-            <w:tcW w:w="4986" w:type="dxa"/>
-          </w:tcPr>
-          <w:p>
-            <w:r>
-              <w:rPr>
-                <w:sz w:val="20"/>
-              </w:rPr>
-              <w:t>Concurrent provisioning errors</w:t>
-            </w:r>
-          </w:p>
-        </w:tc>
-        <w:tc>
-          <w:tcPr>
-            <w:tcW w:w="4986" w:type="dxa"/>
-          </w:tcPr>
-          <w:p>
-            <w:pPr>
-              <w:cnfStyle w:val="000000100000" w:firstRow="0" w:lastRow="0" w:firstColumn="0" w:lastColumn="0" w:oddVBand="0" w:evenVBand="0" w:oddHBand="1" w:evenHBand="0" w:firstRowFirstColumn="0" w:firstRowLastColumn="0" w:lastRowFirstColumn="0" w:lastRowLastColumn="0"/>
-            </w:pPr>
-            <w:r>
-              <w:rPr>
-                <w:sz w:val="20"/>
-              </w:rPr>
-              <w:t>ARM long-running operations isolated to background workers (MaxConcurrentCalls configurable); 10-minute lock renewal covers slow ARM calls; saga retries on transient failure.</w:t>
-            </w:r>
-          </w:p>
-        </w:tc>
-      </w:tr>
-      <w:tr>
-        <w:trPr>
-          <w:cnfStyle w:val="000000010000" w:firstRow="0" w:lastRow="0" w:firstColumn="0" w:lastColumn="0" w:oddVBand="0" w:evenVBand="0" w:oddHBand="0" w:evenHBand="1" w:firstRowFirstColumn="0" w:firstRowLastColumn="0" w:lastRowFirstColumn="0" w:lastRowLastColumn="0"/>
-        </w:trPr>
-        <w:tc>
-          <w:tcPr>
-            <w:cnfStyle w:val="001000000000" w:firstRow="0" w:lastRow="0" w:firstColumn="1" w:lastColumn="0" w:oddVBand="0" w:evenVBand="0" w:oddHBand="0" w:evenHBand="0" w:firstRowFirstColumn="0" w:firstRowLastColumn="0" w:lastRowFirstColumn="0" w:lastRowLastColumn="0"/>
-            <w:tcW w:w="4986" w:type="dxa"/>
-          </w:tcPr>
-          <w:p>
-            <w:r>
-              <w:rPr>
-                <w:sz w:val="20"/>
-              </w:rPr>
-              <w:t>Multi-subscription / multi-tenant identity</w:t>
-            </w:r>
-          </w:p>
-        </w:tc>
-        <w:tc>
-          <w:tcPr>
-            <w:tcW w:w="4986" w:type="dxa"/>
-          </w:tcPr>
-          <w:p>
-            <w:pPr>
-              <w:cnfStyle w:val="000000010000" w:firstRow="0" w:lastRow="0" w:firstColumn="0" w:lastColumn="0" w:oddVBand="0" w:evenVBand="0" w:oddHBand="0" w:evenHBand="1" w:firstRowFirstColumn="0" w:firstRowLastColumn="0" w:lastRowFirstColumn="0" w:lastRowLastColumn="0"/>
-            </w:pPr>
-            <w:r>
-              <w:rPr>
-                <w:sz w:val="20"/>
-              </w:rPr>
-              <w:t>Azure:SubscriptionId is explicit in configuration to avoid the "default subscription" pitfall observed in this POC.</w:t>
-            </w:r>
-          </w:p>
-        </w:tc>
-      </w:tr>
-    </w:tbl>
-    <w:p>
-      <w:pPr>
-        <w:pStyle w:val="Heading1"/>
-      </w:pPr>
-      <w:r>
-        <w:rPr>
-          <w:rFonts w:ascii="Calibri" w:hAnsi="Calibri" w:cs="Calibri"/>
-          <w:color w:val="0F4C81"/>
-        </w:rPr>
-        <w:t>8. Recommendation</w:t>
+        <w:t>7. Recommendation</w:t>
       </w:r>
     </w:p>
     <w:p>
@@ -2152,40 +1890,24 @@
         </w:rPr>
         <w:t xml:space="preserve">It is recommended to proceed with the production hardening phases outlined above and plan a phased migration of existing workspaces. The POC code, manifests, and provisioning scripts </w:t>
       </w:r>
-      <w:proofErr w:type="gramStart"/>
-      <w:r>
-        <w:rPr>
-          <w:b/>
-        </w:rPr>
-        <w:t xml:space="preserve">are </w:t>
-      </w:r>
       <w:r>
         <w:rPr>
           <w:b/>
         </w:rPr>
         <w:t>can be</w:t>
       </w:r>
-      <w:proofErr w:type="gramEnd"/>
       <w:r>
         <w:rPr>
           <w:b/>
         </w:rPr>
         <w:t xml:space="preserve"> reusable in existing workspace application code </w:t>
       </w:r>
-      <w:proofErr w:type="gramStart"/>
       <w:r>
         <w:rPr>
           <w:b/>
         </w:rPr>
-        <w:t xml:space="preserve">base </w:t>
+        <w:t>base.</w:t>
       </w:r>
-      <w:r>
-        <w:rPr>
-          <w:b/>
-        </w:rPr>
-        <w:t>.</w:t>
-      </w:r>
-      <w:proofErr w:type="gramEnd"/>
     </w:p>
     <w:p/>
     <w:sectPr>

</xml_diff>